<commit_message>
docs: refresh System Guide (docx + pdf)
Regenerated to reflect the 21-commit parity + polish sweep that landed
in this session (Services / Dashboard / Evaluations / Incidents /
Maintenance / Governance / Data Policy / Settings).

Co-Authored-By: Claude Opus 4.7 (1M context) <noreply@anthropic.com>
</commit_message>
<xml_diff>
--- a/AI_Health_Check_System_Guide.docx
+++ b/AI_Health_Check_System_Guide.docx
@@ -1066,6 +1066,35 @@
     </w:p>
     <w:p>
       <w:pPr>
+        <w:pStyle w:val="Heading2"/>
+        <w:spacing w:after="120" w:before="280"/>
+      </w:pPr>
+      <w:r>
+        <w:rPr>
+          <w:b/>
+          <w:bCs/>
+          <w:color w:val="1B2A4E"/>
+          <w:sz w:val="28"/>
+          <w:szCs w:val="28"/>
+        </w:rPr>
+        <w:t xml:space="preserve">What the live demo carries</w:t>
+      </w:r>
+    </w:p>
+    <w:p>
+      <w:pPr>
+        <w:spacing w:after="160" w:before="80" w:line="320"/>
+      </w:pPr>
+      <w:r>
+        <w:rPr>
+          <w:color w:val="1A1F2B"/>
+          <w:sz w:val="22"/>
+          <w:szCs w:val="22"/>
+        </w:rPr>
+        <w:t xml:space="preserve">The running demo database carries three registered AI services, five tracked incidents, seventeen evaluation runs, sixty-five audit entries, and two hundred and ninety-two scheduled ping logs. That is enough data for every chart to have shape and every workflow to have a story to tell.</w:t>
+      </w:r>
+    </w:p>
+    <w:p>
+      <w:pPr>
         <w:spacing w:after="80" w:before="80"/>
       </w:pPr>
       <w:r>
@@ -1243,7 +1272,7 @@
           <w:sz w:val="22"/>
           <w:szCs w:val="22"/>
         </w:rPr>
-        <w:t xml:space="preserve">A Python application built with FastAPI. It receives requests from the frontend, checks who is allowed to do what, runs the business logic, and writes to the database. All AI calls are routed through one central function, so every safety rule is enforced in one place.</w:t>
+        <w:t xml:space="preserve">A Python application built with FastAPI. Nine routers split the API along module boundaries (services, dashboard, evaluations, incidents, maintenance, audit, users, export, auth). The backend receives requests from the frontend, checks who is allowed to do what, runs the business logic, and writes to the database. All AI calls are routed through one central function, so every safety rule is enforced in one place.</w:t>
       </w:r>
     </w:p>
     <w:p>
@@ -1272,7 +1301,7 @@
           <w:sz w:val="22"/>
           <w:szCs w:val="22"/>
         </w:rPr>
-        <w:t xml:space="preserve">A SQLite database keeps every record: services, evaluations, incidents, maintenance plans, audit entries, and users. The audit log is append-only, protected by database triggers so rows cannot be altered or deleted.</w:t>
+        <w:t xml:space="preserve">A SQLite database keeps every record across fourteen related tables: services, evaluations, incidents, maintenance plans, audit entries, users, and so on. Foreign keys are enforced at every relationship, and the audit log is append-only, protected by database triggers so rows cannot be altered or deleted.</w:t>
       </w:r>
     </w:p>
     <w:p>
@@ -1302,6 +1331,35 @@
           <w:szCs w:val="22"/>
         </w:rPr>
         <w:t xml:space="preserve">The platform talks to Anthropic’s Claude through one pipeline. Claude does the thinking for judge scoring, incident summaries, and compliance narratives. Every call passes through six safety stages before and after, and every call is fully logged.</w:t>
+      </w:r>
+    </w:p>
+    <w:p>
+      <w:pPr>
+        <w:pStyle w:val="Heading3"/>
+        <w:spacing w:after="80" w:before="200"/>
+      </w:pPr>
+      <w:r>
+        <w:rPr>
+          <w:b/>
+          <w:bCs/>
+          <w:color w:val="2E6FDB"/>
+          <w:sz w:val="24"/>
+          <w:szCs w:val="24"/>
+        </w:rPr>
+        <w:t xml:space="preserve">Background jobs — the heartbeat</w:t>
+      </w:r>
+    </w:p>
+    <w:p>
+      <w:pPr>
+        <w:spacing w:after="160" w:before="80" w:line="320"/>
+      </w:pPr>
+      <w:r>
+        <w:rPr>
+          <w:color w:val="1A1F2B"/>
+          <w:sz w:val="22"/>
+          <w:szCs w:val="22"/>
+        </w:rPr>
+        <w:t xml:space="preserve">An in-process scheduler runs two recurring jobs. A health check pings every registered service every five minutes and records latency. An evaluation run executes every active non-confidential service’s test cases through Claude every sixty minutes and writes the resulting drift signals. Both jobs can be disabled with a single environment flag for stable demos.</w:t>
       </w:r>
     </w:p>
     <w:p>
@@ -1538,6 +1596,19 @@
     </w:p>
     <w:p>
       <w:pPr>
+        <w:spacing w:after="160" w:before="80" w:line="320"/>
+      </w:pPr>
+      <w:r>
+        <w:rPr>
+          <w:color w:val="1A1F2B"/>
+          <w:sz w:val="22"/>
+          <w:szCs w:val="22"/>
+        </w:rPr>
+        <w:t xml:space="preserve">Those four modules surface in the user interface as nine pages — Dashboard, Services, Evaluations, Incidents, Maintenance (inside the incident detail view), Governance, Auth, Settings, and Data Policy. Every page follows the same conventions for polling cadence, timestamps, error handling, and audit logging.</w:t>
+      </w:r>
+    </w:p>
+    <w:p>
+      <w:pPr>
         <w:pStyle w:val="Heading2"/>
         <w:spacing w:after="120" w:before="280"/>
       </w:pPr>
@@ -2096,6 +2167,19 @@
     </w:p>
     <w:p>
       <w:pPr>
+        <w:spacing w:after="160" w:before="80" w:line="320"/>
+      </w:pPr>
+      <w:r>
+        <w:rPr>
+          <w:color w:val="1A1F2B"/>
+          <w:sz w:val="22"/>
+          <w:szCs w:val="22"/>
+        </w:rPr>
+        <w:t xml:space="preserve">The 20-character requirement is enforced at three layers: the browser refuses to submit a short note, the request layer (Pydantic) rejects it again, and the request handler re-verifies before promoting the draft. Each layer alone could be bypassed by curl or a stale tab; together they cannot.</w:t>
+      </w:r>
+    </w:p>
+    <w:p>
+      <w:pPr>
         <w:pStyle w:val="Heading3"/>
         <w:spacing w:after="80" w:before="200"/>
       </w:pPr>
@@ -3071,7 +3155,7 @@
           <w:sz w:val="22"/>
           <w:szCs w:val="22"/>
         </w:rPr>
-        <w:t xml:space="preserve">Budget reserve — the call must fit inside the daily and per-minute budgets; concurrent calls cannot collectively overspend.</w:t>
+        <w:t xml:space="preserve">Budget reserve — the call must fit inside the daily and per-minute budgets; concurrent calls cannot collectively overspend. The platform enforces thirty calls per minute globally, twenty per user per minute, five US dollars per day, and twenty-five US dollars per month.</w:t>
       </w:r>
     </w:p>
     <w:p>
@@ -3605,43 +3689,61 @@
           <w:sz w:val="22"/>
           <w:szCs w:val="22"/>
         </w:rPr>
-        <w:t xml:space="preserve">Around 120 tests covering authentication, services, evaluations, incidents, governance, and the AI pipeline.</w:t>
-      </w:r>
-    </w:p>
-    <w:p>
-      <w:pPr>
-        <w:pStyle w:val="ListParagraph"/>
-        <w:numPr>
-          <w:ilvl w:val="0"/>
-          <w:numId w:val="2"/>
-        </w:numPr>
-        <w:spacing w:after="40" w:before="40" w:line="300"/>
-      </w:pPr>
-      <w:r>
-        <w:rPr>
-          <w:color w:val="1A1F2B"/>
-          <w:sz w:val="22"/>
-          <w:szCs w:val="22"/>
-        </w:rPr>
-        <w:t xml:space="preserve">Coverage is measured and must stay above a floor; currently around seventy percent of the code is exercised.</w:t>
-      </w:r>
-    </w:p>
-    <w:p>
-      <w:pPr>
-        <w:pStyle w:val="ListParagraph"/>
-        <w:numPr>
-          <w:ilvl w:val="0"/>
-          <w:numId w:val="2"/>
-        </w:numPr>
-        <w:spacing w:after="40" w:before="40" w:line="300"/>
-      </w:pPr>
-      <w:r>
-        <w:rPr>
-          <w:color w:val="1A1F2B"/>
-          <w:sz w:val="22"/>
-          <w:szCs w:val="22"/>
-        </w:rPr>
-        <w:t xml:space="preserve">Tests run in seconds because they use an in-memory database and a simulated AI client — no network calls, no cost.</w:t>
+        <w:t xml:space="preserve">One hundred and thirty-five tests across thirteen test files, covering authentication, services, evaluations, incidents, governance, drafts, and the AI pipeline.</w:t>
+      </w:r>
+    </w:p>
+    <w:p>
+      <w:pPr>
+        <w:pStyle w:val="ListParagraph"/>
+        <w:numPr>
+          <w:ilvl w:val="0"/>
+          <w:numId w:val="2"/>
+        </w:numPr>
+        <w:spacing w:after="40" w:before="40" w:line="300"/>
+      </w:pPr>
+      <w:r>
+        <w:rPr>
+          <w:color w:val="1A1F2B"/>
+          <w:sz w:val="22"/>
+          <w:szCs w:val="22"/>
+        </w:rPr>
+        <w:t xml:space="preserve">Coverage is measured and must stay above a sixty-five percent floor that fails the build if it drops; the actual coverage today is around seventy-one percent.</w:t>
+      </w:r>
+    </w:p>
+    <w:p>
+      <w:pPr>
+        <w:pStyle w:val="ListParagraph"/>
+        <w:numPr>
+          <w:ilvl w:val="0"/>
+          <w:numId w:val="2"/>
+        </w:numPr>
+        <w:spacing w:after="40" w:before="40" w:line="300"/>
+      </w:pPr>
+      <w:r>
+        <w:rPr>
+          <w:color w:val="1A1F2B"/>
+          <w:sz w:val="22"/>
+          <w:szCs w:val="22"/>
+        </w:rPr>
+        <w:t xml:space="preserve">The full suite runs in roughly forty-six seconds because tests use an in-memory database and a simulated AI client — no network calls, no cost.</w:t>
+      </w:r>
+    </w:p>
+    <w:p>
+      <w:pPr>
+        <w:pStyle w:val="ListParagraph"/>
+        <w:numPr>
+          <w:ilvl w:val="0"/>
+          <w:numId w:val="2"/>
+        </w:numPr>
+        <w:spacing w:after="40" w:before="40" w:line="300"/>
+      </w:pPr>
+      <w:r>
+        <w:rPr>
+          <w:color w:val="1A1F2B"/>
+          <w:sz w:val="22"/>
+          <w:szCs w:val="22"/>
+        </w:rPr>
+        <w:t xml:space="preserve">The codebase is around eight thousand lines of backend Python, six thousand lines of React, and two and a half thousand lines of tests.</w:t>
       </w:r>
     </w:p>
     <w:p>
@@ -3685,7 +3787,7 @@
           <w:sz w:val="22"/>
           <w:szCs w:val="22"/>
         </w:rPr>
-        <w:t xml:space="preserve">twenty simulated callers hit the budget reservation at the same moment; the platform must still never exceed the budget.</w:t>
+        <w:t xml:space="preserve">twenty simulated callers hit the budget reservation at the same moment with the rate limit set to five; the platform must let exactly five through and reject the rest.</w:t>
       </w:r>
     </w:p>
     <w:p>
@@ -3713,7 +3815,7 @@
           <w:sz w:val="22"/>
           <w:szCs w:val="22"/>
         </w:rPr>
-        <w:t xml:space="preserve">the test tampers with the audit log, then checks that the verify function detects the break.</w:t>
+        <w:t xml:space="preserve">the test tampers with the audit log, then checks that the verify function detects the break, and that foreign-key constraints and monotonic timestamps still hold.</w:t>
       </w:r>
     </w:p>
     <w:p>
@@ -3741,7 +3843,7 @@
           <w:sz w:val="22"/>
           <w:szCs w:val="22"/>
         </w:rPr>
-        <w:t xml:space="preserve">the strict judge-score parser is fed malformed AI responses; only clean numbers are accepted, everything else is marked as a refusal.</w:t>
+        <w:t xml:space="preserve">the strict judge-score parser is fed malformed AI responses; only clean numbers are accepted, everything else is marked as a refusal and excluded from aggregates.</w:t>
       </w:r>
     </w:p>
     <w:p>
@@ -3769,7 +3871,63 @@
           <w:sz w:val="22"/>
           <w:szCs w:val="22"/>
         </w:rPr>
-        <w:t xml:space="preserve">dozens of URLs are fed through the safety validator to prove dangerous addresses are blocked and legitimate ones are allowed.</w:t>
+        <w:t xml:space="preserve">ten URL families are fed through the safety validator (cloud metadata, RFC1918, IPv6 loopback, DNS-rebinding) to prove dangerous addresses are blocked and legitimate ones are allowed.</w:t>
+      </w:r>
+    </w:p>
+    <w:p>
+      <w:pPr>
+        <w:pStyle w:val="ListParagraph"/>
+        <w:numPr>
+          <w:ilvl w:val="0"/>
+          <w:numId w:val="2"/>
+        </w:numPr>
+        <w:spacing w:after="40" w:before="40" w:line="300"/>
+      </w:pPr>
+      <w:r>
+        <w:rPr>
+          <w:b/>
+          <w:bCs/>
+          <w:color w:val="1B2A4E"/>
+          <w:sz w:val="22"/>
+          <w:szCs w:val="22"/>
+        </w:rPr>
+        <w:t xml:space="preserve">Auth test — </w:t>
+      </w:r>
+      <w:r>
+        <w:rPr>
+          <w:color w:val="1A1F2B"/>
+          <w:sz w:val="22"/>
+          <w:szCs w:val="22"/>
+        </w:rPr>
+        <w:t xml:space="preserve">login success, login failure, and account lockout after repeated failures are all covered; every attempt is audited.</w:t>
+      </w:r>
+    </w:p>
+    <w:p>
+      <w:pPr>
+        <w:pStyle w:val="ListParagraph"/>
+        <w:numPr>
+          <w:ilvl w:val="0"/>
+          <w:numId w:val="2"/>
+        </w:numPr>
+        <w:spacing w:after="40" w:before="40" w:line="300"/>
+      </w:pPr>
+      <w:r>
+        <w:rPr>
+          <w:b/>
+          <w:bCs/>
+          <w:color w:val="1B2A4E"/>
+          <w:sz w:val="22"/>
+          <w:szCs w:val="22"/>
+        </w:rPr>
+        <w:t xml:space="preserve">Compliance test suite — </w:t>
+      </w:r>
+      <w:r>
+        <w:rPr>
+          <w:color w:val="1A1F2B"/>
+          <w:sz w:val="22"/>
+          <w:szCs w:val="22"/>
+        </w:rPr>
+        <w:t xml:space="preserve">twenty-eight tests covering hash-chain integrity, tamper detection, strict date parsing on exports, audit-log timezone correctness, and the rule that every export itself writes an audit entry.</w:t>
       </w:r>
     </w:p>
     <w:p>
@@ -3814,6 +3972,215 @@
           <w:sz w:val="28"/>
           <w:szCs w:val="28"/>
         </w:rPr>
+        <w:t xml:space="preserve">Conventions every module follows</w:t>
+      </w:r>
+    </w:p>
+    <w:p>
+      <w:pPr>
+        <w:spacing w:after="160" w:before="80" w:line="320"/>
+      </w:pPr>
+      <w:r>
+        <w:rPr>
+          <w:color w:val="1A1F2B"/>
+          <w:sz w:val="22"/>
+          <w:szCs w:val="22"/>
+        </w:rPr>
+        <w:t xml:space="preserve">One of the quiet strengths of the platform is that every module behaves the same way. A reviewer who learns the conventions on one page can predict what will happen on every other page. The following rules are enforced across all nine pages.</w:t>
+      </w:r>
+    </w:p>
+    <w:p>
+      <w:pPr>
+        <w:pStyle w:val="ListParagraph"/>
+        <w:numPr>
+          <w:ilvl w:val="0"/>
+          <w:numId w:val="2"/>
+        </w:numPr>
+        <w:spacing w:after="40" w:before="40" w:line="300"/>
+      </w:pPr>
+      <w:r>
+        <w:rPr>
+          <w:color w:val="1A1F2B"/>
+          <w:sz w:val="22"/>
+          <w:szCs w:val="22"/>
+        </w:rPr>
+        <w:t xml:space="preserve">Timestamps are stored in UTC and rendered in the viewer’s local time with a tooltip showing the original zone.</w:t>
+      </w:r>
+    </w:p>
+    <w:p>
+      <w:pPr>
+        <w:pStyle w:val="ListParagraph"/>
+        <w:numPr>
+          <w:ilvl w:val="0"/>
+          <w:numId w:val="2"/>
+        </w:numPr>
+        <w:spacing w:after="40" w:before="40" w:line="300"/>
+      </w:pPr>
+      <w:r>
+        <w:rPr>
+          <w:color w:val="1A1F2B"/>
+          <w:sz w:val="22"/>
+          <w:szCs w:val="22"/>
+        </w:rPr>
+        <w:t xml:space="preserve">List endpoints that return service-scoped data are filtered through one shared helper so the environment tabs (Dev, Staging, Production) work identically everywhere.</w:t>
+      </w:r>
+    </w:p>
+    <w:p>
+      <w:pPr>
+        <w:pStyle w:val="ListParagraph"/>
+        <w:numPr>
+          <w:ilvl w:val="0"/>
+          <w:numId w:val="2"/>
+        </w:numPr>
+        <w:spacing w:after="40" w:before="40" w:line="300"/>
+      </w:pPr>
+      <w:r>
+        <w:rPr>
+          <w:color w:val="1A1F2B"/>
+          <w:sz w:val="22"/>
+          <w:szCs w:val="22"/>
+        </w:rPr>
+        <w:t xml:space="preserve">Every page that shows live data polls at thirty seconds and displays a visible “updated N seconds ago” indicator with a one-shot pulse animation.</w:t>
+      </w:r>
+    </w:p>
+    <w:p>
+      <w:pPr>
+        <w:pStyle w:val="ListParagraph"/>
+        <w:numPr>
+          <w:ilvl w:val="0"/>
+          <w:numId w:val="2"/>
+        </w:numPr>
+        <w:spacing w:after="40" w:before="40" w:line="300"/>
+      </w:pPr>
+      <w:r>
+        <w:rPr>
+          <w:color w:val="1A1F2B"/>
+          <w:sz w:val="22"/>
+          <w:szCs w:val="22"/>
+        </w:rPr>
+        <w:t xml:space="preserve">Every parent-child relationship with a required foreign key cascades deletes so the database can never hold orphan rows.</w:t>
+      </w:r>
+    </w:p>
+    <w:p>
+      <w:pPr>
+        <w:pStyle w:val="ListParagraph"/>
+        <w:numPr>
+          <w:ilvl w:val="0"/>
+          <w:numId w:val="2"/>
+        </w:numPr>
+        <w:spacing w:after="40" w:before="40" w:line="300"/>
+      </w:pPr>
+      <w:r>
+        <w:rPr>
+          <w:color w:val="1A1F2B"/>
+          <w:sz w:val="22"/>
+          <w:szCs w:val="22"/>
+        </w:rPr>
+        <w:t xml:space="preserve">Every user-provided text field has a maximum length, enforced in the schema layer.</w:t>
+      </w:r>
+    </w:p>
+    <w:p>
+      <w:pPr>
+        <w:pStyle w:val="ListParagraph"/>
+        <w:numPr>
+          <w:ilvl w:val="0"/>
+          <w:numId w:val="2"/>
+        </w:numPr>
+        <w:spacing w:after="40" w:before="40" w:line="300"/>
+      </w:pPr>
+      <w:r>
+        <w:rPr>
+          <w:color w:val="1A1F2B"/>
+          <w:sz w:val="22"/>
+          <w:szCs w:val="22"/>
+        </w:rPr>
+        <w:t xml:space="preserve">Every mutation — create, update, delete, approve, export — writes an audit entry through the same helper.</w:t>
+      </w:r>
+    </w:p>
+    <w:p>
+      <w:pPr>
+        <w:pStyle w:val="ListParagraph"/>
+        <w:numPr>
+          <w:ilvl w:val="0"/>
+          <w:numId w:val="2"/>
+        </w:numPr>
+        <w:spacing w:after="40" w:before="40" w:line="300"/>
+      </w:pPr>
+      <w:r>
+        <w:rPr>
+          <w:color w:val="1A1F2B"/>
+          <w:sz w:val="22"/>
+          <w:szCs w:val="22"/>
+        </w:rPr>
+        <w:t xml:space="preserve">Every approval endpoint is idempotent: a second click returns a 409 Conflict so the original approver’s attribution is never overwritten.</w:t>
+      </w:r>
+    </w:p>
+    <w:p>
+      <w:pPr>
+        <w:pStyle w:val="ListParagraph"/>
+        <w:numPr>
+          <w:ilvl w:val="0"/>
+          <w:numId w:val="2"/>
+        </w:numPr>
+        <w:spacing w:after="40" w:before="40" w:line="300"/>
+      </w:pPr>
+      <w:r>
+        <w:rPr>
+          <w:color w:val="1A1F2B"/>
+          <w:sz w:val="22"/>
+          <w:szCs w:val="22"/>
+        </w:rPr>
+        <w:t xml:space="preserve">Every form uses inline errors and toast notifications, not blocking alert dialogs.</w:t>
+      </w:r>
+    </w:p>
+    <w:p>
+      <w:pPr>
+        <w:pStyle w:val="ListParagraph"/>
+        <w:numPr>
+          <w:ilvl w:val="0"/>
+          <w:numId w:val="2"/>
+        </w:numPr>
+        <w:spacing w:after="40" w:before="40" w:line="300"/>
+      </w:pPr>
+      <w:r>
+        <w:rPr>
+          <w:color w:val="1A1F2B"/>
+          <w:sz w:val="22"/>
+          <w:szCs w:val="22"/>
+        </w:rPr>
+        <w:t xml:space="preserve">Every trend chip (Improving, Stable, Worsening) is colour-matched to the verdict semantics, so green always means good and red always means bad.</w:t>
+      </w:r>
+    </w:p>
+    <w:p>
+      <w:pPr>
+        <w:pStyle w:val="ListParagraph"/>
+        <w:numPr>
+          <w:ilvl w:val="0"/>
+          <w:numId w:val="2"/>
+        </w:numPr>
+        <w:spacing w:after="40" w:before="40" w:line="300"/>
+      </w:pPr>
+      <w:r>
+        <w:rPr>
+          <w:color w:val="1A1F2B"/>
+          <w:sz w:val="22"/>
+          <w:szCs w:val="22"/>
+        </w:rPr>
+        <w:t xml:space="preserve">Every loading, approving, or verifying state exposes an accessibility marker (aria-busy, aria-live) so screen readers follow along.</w:t>
+      </w:r>
+    </w:p>
+    <w:p>
+      <w:pPr>
+        <w:pStyle w:val="Heading2"/>
+        <w:spacing w:after="120" w:before="280"/>
+      </w:pPr>
+      <w:r>
+        <w:rPr>
+          <w:b/>
+          <w:bCs/>
+          <w:color w:val="1B2A4E"/>
+          <w:sz w:val="28"/>
+          <w:szCs w:val="28"/>
+        </w:rPr>
         <w:t xml:space="preserve">Why reliability matters here</w:t>
       </w:r>
     </w:p>
@@ -4092,7 +4459,7 @@
           <w:sz w:val="22"/>
           <w:szCs w:val="22"/>
         </w:rPr>
-        <w:t xml:space="preserve">Defence in depth. No single safeguard carries the whole weight. The approval contract requires a reviewer note at three points (browser, request boundary, and server). The audit log is append-only both by design and by database trigger. The AI pipeline runs six safety stages. If any one defence fails, the others catch the rest.</w:t>
+        <w:t xml:space="preserve">Defence in depth. No single safeguard carries the whole weight. The approval contract is triple-gated — the browser checks the reviewer note length, the request boundary (Pydantic) checks it again, and the request handler re-verifies before promoting the draft. The audit log is append-only both by design and by database trigger. The AI pipeline runs six safety stages. If any one defence fails, the others catch the rest.</w:t>
       </w:r>
     </w:p>
     <w:p>
@@ -4359,6 +4726,34 @@
           <w:sz w:val="22"/>
           <w:szCs w:val="22"/>
         </w:rPr>
+        <w:t xml:space="preserve">Convention parity across every page — </w:t>
+      </w:r>
+      <w:r>
+        <w:rPr>
+          <w:color w:val="1A1F2B"/>
+          <w:sz w:val="22"/>
+          <w:szCs w:val="22"/>
+        </w:rPr>
+        <w:t xml:space="preserve">a reviewer learns the timestamp, polling, audit, and cascade-delete conventions once and can predict the same behaviour on every one of the nine pages. No surprises.</w:t>
+      </w:r>
+    </w:p>
+    <w:p>
+      <w:pPr>
+        <w:pStyle w:val="ListParagraph"/>
+        <w:numPr>
+          <w:ilvl w:val="0"/>
+          <w:numId w:val="2"/>
+        </w:numPr>
+        <w:spacing w:after="40" w:before="40" w:line="300"/>
+      </w:pPr>
+      <w:r>
+        <w:rPr>
+          <w:b/>
+          <w:bCs/>
+          <w:color w:val="1B2A4E"/>
+          <w:sz w:val="22"/>
+          <w:szCs w:val="22"/>
+        </w:rPr>
         <w:t xml:space="preserve">Honest scope — </w:t>
       </w:r>
       <w:r>
@@ -4628,6 +5023,146 @@
           <w:szCs w:val="22"/>
         </w:rPr>
         <w:t xml:space="preserve">role-based access decides what actions a user can take, not which services they can see. Per-team isolation is a documented next step.</w:t>
+      </w:r>
+    </w:p>
+    <w:p>
+      <w:pPr>
+        <w:pStyle w:val="ListParagraph"/>
+        <w:numPr>
+          <w:ilvl w:val="0"/>
+          <w:numId w:val="2"/>
+        </w:numPr>
+        <w:spacing w:after="40" w:before="40" w:line="300"/>
+      </w:pPr>
+      <w:r>
+        <w:rPr>
+          <w:b/>
+          <w:bCs/>
+          <w:color w:val="1B2A4E"/>
+          <w:sz w:val="22"/>
+          <w:szCs w:val="22"/>
+        </w:rPr>
+        <w:t xml:space="preserve">Role-change UI uses a browser confirm dialog — </w:t>
+      </w:r>
+      <w:r>
+        <w:rPr>
+          <w:color w:val="1A1F2B"/>
+          <w:sz w:val="22"/>
+          <w:szCs w:val="22"/>
+        </w:rPr>
+        <w:t xml:space="preserve">changing a user’s role still pops a native confirm() rather than the shared modal. The underlying action is fully audited and RBAC-gated; the cosmetic fix is on the backlog.</w:t>
+      </w:r>
+    </w:p>
+    <w:p>
+      <w:pPr>
+        <w:pStyle w:val="ListParagraph"/>
+        <w:numPr>
+          <w:ilvl w:val="0"/>
+          <w:numId w:val="2"/>
+        </w:numPr>
+        <w:spacing w:after="40" w:before="40" w:line="300"/>
+      </w:pPr>
+      <w:r>
+        <w:rPr>
+          <w:b/>
+          <w:bCs/>
+          <w:color w:val="1B2A4E"/>
+          <w:sz w:val="22"/>
+          <w:szCs w:val="22"/>
+        </w:rPr>
+        <w:t xml:space="preserve">No delete-user endpoint — </w:t>
+      </w:r>
+      <w:r>
+        <w:rPr>
+          <w:color w:val="1A1F2B"/>
+          <w:sz w:val="22"/>
+          <w:szCs w:val="22"/>
+        </w:rPr>
+        <w:t xml:space="preserve">users cannot be removed yet; the audit log would hold dangling references. When the endpoint ships it will use a set-null-on-delete policy so the historical trail is preserved.</w:t>
+      </w:r>
+    </w:p>
+    <w:p>
+      <w:pPr>
+        <w:pStyle w:val="ListParagraph"/>
+        <w:numPr>
+          <w:ilvl w:val="0"/>
+          <w:numId w:val="2"/>
+        </w:numPr>
+        <w:spacing w:after="40" w:before="40" w:line="300"/>
+      </w:pPr>
+      <w:r>
+        <w:rPr>
+          <w:b/>
+          <w:bCs/>
+          <w:color w:val="1B2A4E"/>
+          <w:sz w:val="22"/>
+          <w:szCs w:val="22"/>
+        </w:rPr>
+        <w:t xml:space="preserve">Pagination capped at fifty rows — </w:t>
+      </w:r>
+      <w:r>
+        <w:rPr>
+          <w:color w:val="1A1F2B"/>
+          <w:sz w:val="22"/>
+          <w:szCs w:val="22"/>
+        </w:rPr>
+        <w:t xml:space="preserve">audit log and evaluation run listings return at most fifty rows server-side. Fine at current scale; cursor-based pagination is documented for the first time the row count passes one thousand.</w:t>
+      </w:r>
+    </w:p>
+    <w:p>
+      <w:pPr>
+        <w:pStyle w:val="ListParagraph"/>
+        <w:numPr>
+          <w:ilvl w:val="0"/>
+          <w:numId w:val="2"/>
+        </w:numPr>
+        <w:spacing w:after="40" w:before="40" w:line="300"/>
+      </w:pPr>
+      <w:r>
+        <w:rPr>
+          <w:b/>
+          <w:bCs/>
+          <w:color w:val="1B2A4E"/>
+          <w:sz w:val="22"/>
+          <w:szCs w:val="22"/>
+        </w:rPr>
+        <w:t xml:space="preserve">Audit chain is self-anchored — </w:t>
+      </w:r>
+      <w:r>
+        <w:rPr>
+          <w:color w:val="1A1F2B"/>
+          <w:sz w:val="22"/>
+          <w:szCs w:val="22"/>
+        </w:rPr>
+        <w:t xml:space="preserve">the hash chain verifies against itself but is not yet anchored to an external write-once log. A production deployment would publish the daily root to Sigstore or a similar service.</w:t>
+      </w:r>
+    </w:p>
+    <w:p>
+      <w:pPr>
+        <w:pStyle w:val="ListParagraph"/>
+        <w:numPr>
+          <w:ilvl w:val="0"/>
+          <w:numId w:val="2"/>
+        </w:numPr>
+        <w:spacing w:after="40" w:before="40" w:line="300"/>
+      </w:pPr>
+      <w:r>
+        <w:rPr>
+          <w:b/>
+          <w:bCs/>
+          <w:color w:val="1B2A4E"/>
+          <w:sz w:val="22"/>
+          <w:szCs w:val="22"/>
+        </w:rPr>
+        <w:t xml:space="preserve">Drift threshold is heuristic — </w:t>
+      </w:r>
+      <w:r>
+        <w:rPr>
+          <w:color w:val="1A1F2B"/>
+          <w:sz w:val="22"/>
+          <w:szCs w:val="22"/>
+        </w:rPr>
+        <w:t xml:space="preserve">the seventy-five percent quality floor is a reasonable starting value, not a statistically derived one. Eight weeks of baseline data and a two-sigma analysis would replace the heuristic with a calibrated threshold.</w:t>
       </w:r>
     </w:p>
     <w:p>
@@ -4875,7 +5410,7 @@
           <w:sz w:val="22"/>
           <w:szCs w:val="22"/>
         </w:rPr>
-        <w:t xml:space="preserve">Multi-model judge ensemble to reduce bias and improve scoring reliability.</w:t>
+        <w:t xml:space="preserve">Multi-model judge ensemble (for example Claude Haiku as a second judge cross-validating ten percent of runs) to reduce bias and improve scoring reliability.</w:t>
       </w:r>
     </w:p>
     <w:p>
@@ -4929,7 +5464,43 @@
           <w:sz w:val="22"/>
           <w:szCs w:val="22"/>
         </w:rPr>
-        <w:t xml:space="preserve">External timestamp anchoring of the audit chain to a write-once-read-many store.</w:t>
+        <w:t xml:space="preserve">External anchoring of the audit chain — publish the daily Merkle root to Sigstore or an equivalent transparency log so the chain can be verified against an outside witness.</w:t>
+      </w:r>
+    </w:p>
+    <w:p>
+      <w:pPr>
+        <w:pStyle w:val="ListParagraph"/>
+        <w:numPr>
+          <w:ilvl w:val="0"/>
+          <w:numId w:val="2"/>
+        </w:numPr>
+        <w:spacing w:after="40" w:before="40" w:line="300"/>
+      </w:pPr>
+      <w:r>
+        <w:rPr>
+          <w:color w:val="1A1F2B"/>
+          <w:sz w:val="22"/>
+          <w:szCs w:val="22"/>
+        </w:rPr>
+        <w:t xml:space="preserve">Replace the heuristic seventy-five percent drift floor with an eight-week baseline calibration and a two-sigma alert threshold derived from real data.</w:t>
+      </w:r>
+    </w:p>
+    <w:p>
+      <w:pPr>
+        <w:pStyle w:val="ListParagraph"/>
+        <w:numPr>
+          <w:ilvl w:val="0"/>
+          <w:numId w:val="2"/>
+        </w:numPr>
+        <w:spacing w:after="40" w:before="40" w:line="300"/>
+      </w:pPr>
+      <w:r>
+        <w:rPr>
+          <w:color w:val="1A1F2B"/>
+          <w:sz w:val="22"/>
+          <w:szCs w:val="22"/>
+        </w:rPr>
+        <w:t xml:space="preserve">Move from single-approver (Level 1 HITL) to a four-eyes contract where the drafter and the approver must be different users.</w:t>
       </w:r>
     </w:p>
     <w:p>
@@ -5102,7 +5673,7 @@
           <w:sz w:val="22"/>
           <w:szCs w:val="22"/>
         </w:rPr>
-        <w:t xml:space="preserve">Every AI-generated artifact is a draft. A named human must approve it with a note of at least twenty characters before it becomes official.</w:t>
+        <w:t xml:space="preserve">Every AI-generated artifact is a draft. A named human must approve it with a note of at least twenty characters before it becomes official; the rule is enforced at three layers (browser, request boundary, handler).</w:t>
       </w:r>
     </w:p>
     <w:p>
@@ -5175,6 +5746,24 @@
           <w:szCs w:val="22"/>
         </w:rPr>
         <w:t xml:space="preserve">The platform is a reference implementation — SQLite and an in-process scheduler are deliberate simplifications that swap cleanly for production components.</w:t>
+      </w:r>
+    </w:p>
+    <w:p>
+      <w:pPr>
+        <w:pStyle w:val="ListParagraph"/>
+        <w:numPr>
+          <w:ilvl w:val="0"/>
+          <w:numId w:val="8"/>
+        </w:numPr>
+        <w:spacing w:after="40" w:before="40" w:line="300"/>
+      </w:pPr>
+      <w:r>
+        <w:rPr>
+          <w:color w:val="1A1F2B"/>
+          <w:sz w:val="22"/>
+          <w:szCs w:val="22"/>
+        </w:rPr>
+        <w:t xml:space="preserve">One hundred and thirty-five automated tests across thirteen files run in roughly forty-six seconds; the build fails if coverage drops below a sixty-five percent floor.</w:t>
       </w:r>
     </w:p>
     <w:p>
@@ -5297,7 +5886,7 @@
                 <w:sz w:val="22"/>
                 <w:szCs w:val="22"/>
               </w:rPr>
-              <w:t xml:space="preserve">We built a centralised AI operations platform. Teams running AI services in production have no single place to see how those services are behaving — uptime is tracked, behaviour is not. Our platform gives them one dashboard for quality, a structured incident workflow when something breaks, and a tamper-evident audit trail that an auditor can trust. Every AI-generated summary, draft, or insight must be reviewed and approved by a named human with a note. Every action is cryptographically chained. One schema, one audit chain, one human-in-the-loop contract. It is a reference implementation with 123 automated tests, so every claim the platform makes is backed by a test that proves it works.</w:t>
+              <w:t xml:space="preserve">We built a centralised AI operations platform. Teams running AI services in production have no single place to see how those services are behaving — uptime is tracked, behaviour is not. Our platform gives them one dashboard for quality, a structured incident workflow when something breaks, and a tamper-evident audit trail that an auditor can trust. Every AI-generated summary, draft, or insight must be reviewed and approved by a named human with a note. Every action is cryptographically chained. One schema, one audit chain, one human-in-the-loop contract. It is a reference implementation with 135 automated tests, so every claim the platform makes is backed by a test that proves it works.</w:t>
             </w:r>
           </w:p>
         </w:tc>
@@ -5403,7 +5992,7 @@
           <w:sz w:val="22"/>
           <w:szCs w:val="22"/>
         </w:rPr>
-        <w:t xml:space="preserve">When asked “what does your platform actually do?” start with the problem: “Teams running AI features have no single place to see whether their AI is still behaving correctly. Uptime does not mean quality.” Then give the solution: “Our platform is one web app that covers monitoring, evaluation, incidents, and compliance — with a human-in-the-loop contract on every AI output and a tamper-evident audit chain.” Finish with the proof: “One hundred and twenty-three automated tests back the platform’s claims. A single button verifies the audit chain is intact. A single date range produces a compliance report an auditor can read.”</w:t>
+        <w:t xml:space="preserve">When asked “what does your platform actually do?” start with the problem: “Teams running AI features have no single place to see whether their AI is still behaving correctly. Uptime does not mean quality.” Then give the solution: “Our platform is one web app that covers monitoring, evaluation, incidents, and compliance — with a human-in-the-loop contract on every AI output and a tamper-evident audit chain.” Finish with the proof: “One hundred and thirty-five automated tests back the platform’s claims. A single button verifies the audit chain is intact. A single date range produces a compliance report an auditor can read.”</w:t>
       </w:r>
     </w:p>
     <w:p>

</xml_diff>

<commit_message>
docs: two-tier architecture + honest scoring
Bring the written documentation in line with the code that now lives on
the branch.

Updated
  - README.md: overview, setup, and env-var list reflect actor / judge /
    injection-classifier split.
  - docs/ARCHITECTURE.md: two-tier model economy, fail-open safety
    layer, and incomplete-run semantics added to the architecture write-up.
  - docs/TECHNICAL_REFERENCE.md: JUDGE_MODEL / INJECTION_MODEL config,
    new EvalRun fields, updated budget defaults.
  - AI_Health_Check_System_Guide (docx + pdf): refreshed system guide
    export matching the new architecture.

New
  - AI_Health_Check_Architecture.html + .pdf: standalone architecture
    diagram / narrative artifact for stakeholder handout.

Co-Authored-By: Claude Opus 4.7 (1M context) <noreply@anthropic.com>
</commit_message>
<xml_diff>
--- a/AI_Health_Check_System_Guide.docx
+++ b/AI_Health_Check_System_Guide.docx
@@ -1330,7 +1330,7 @@
           <w:sz w:val="22"/>
           <w:szCs w:val="22"/>
         </w:rPr>
-        <w:t xml:space="preserve">The platform talks to Anthropic’s Claude through one pipeline. Claude does the thinking for judge scoring, incident summaries, and compliance narratives. Every call passes through six safety stages before and after, and every call is fully logged.</w:t>
+        <w:t xml:space="preserve">The platform talks to Anthropic’s Claude through one pipeline, but with a two-tier model economy. Claude Sonnet 4.6 plays the actor role — the service under test, incident summaries, dashboard insights, and compliance narratives. Claude Haiku 4.5 plays every judge role — factuality scoring, hallucination detection, and an independent prompt-injection classifier that backs up the regex tripwire. Using a smaller, differently trained model for the judges partially breaks the “model scoring itself” correlation and keeps the judge layer cheap. Every call passes through the same six safety stages before and after, and every call is fully logged with per-model cost accounting.</w:t>
       </w:r>
     </w:p>
     <w:p>
@@ -1917,7 +1917,7 @@
           <w:sz w:val="22"/>
           <w:szCs w:val="22"/>
         </w:rPr>
-        <w:t xml:space="preserve">Evaluation means running a small exam against an AI service. The exam is a question bank of test cases — each with a question and an expected answer. The service replies to each question, and a separate AI judge scores the reply for factuality and hallucination. The run produces one overall quality score.</w:t>
+        <w:t xml:space="preserve">Evaluation means running a small exam against an AI service. The exam is a question bank of test cases — each with a question and an expected answer. The service replies to each question, and a separate, smaller judge model (Claude Haiku 4.5) scores the reply for factuality and hallucination. Using a different model from the one under test partially breaks the “model scoring itself” correlation, and the platform records which judge model produced each run so auditors can trace any score back to the exact grader that generated it. The run produces one overall quality score.</w:t>
       </w:r>
     </w:p>
     <w:p>
@@ -2942,79 +2942,97 @@
           <w:sz w:val="22"/>
           <w:szCs w:val="22"/>
         </w:rPr>
-        <w:t xml:space="preserve">Judge scoring — a second AI call grades the answers from a service under test.</w:t>
-      </w:r>
-    </w:p>
-    <w:p>
-      <w:pPr>
-        <w:pStyle w:val="ListParagraph"/>
-        <w:numPr>
-          <w:ilvl w:val="0"/>
-          <w:numId w:val="2"/>
-        </w:numPr>
-        <w:spacing w:after="40" w:before="40" w:line="300"/>
-      </w:pPr>
-      <w:r>
-        <w:rPr>
-          <w:color w:val="1A1F2B"/>
-          <w:sz w:val="22"/>
-          <w:szCs w:val="22"/>
-        </w:rPr>
-        <w:t xml:space="preserve">Hallucination detection — a separate AI call checks whether the service fabricated anything.</w:t>
-      </w:r>
-    </w:p>
-    <w:p>
-      <w:pPr>
-        <w:pStyle w:val="ListParagraph"/>
-        <w:numPr>
-          <w:ilvl w:val="0"/>
-          <w:numId w:val="2"/>
-        </w:numPr>
-        <w:spacing w:after="40" w:before="40" w:line="300"/>
-      </w:pPr>
-      <w:r>
-        <w:rPr>
-          <w:color w:val="1A1F2B"/>
-          <w:sz w:val="22"/>
-          <w:szCs w:val="22"/>
-        </w:rPr>
-        <w:t xml:space="preserve">Incident summaries — AI drafts a stakeholder-friendly write-up of the problem and root causes.</w:t>
-      </w:r>
-    </w:p>
-    <w:p>
-      <w:pPr>
-        <w:pStyle w:val="ListParagraph"/>
-        <w:numPr>
-          <w:ilvl w:val="0"/>
-          <w:numId w:val="2"/>
-        </w:numPr>
-        <w:spacing w:after="40" w:before="40" w:line="300"/>
-      </w:pPr>
-      <w:r>
-        <w:rPr>
-          <w:color w:val="1A1F2B"/>
-          <w:sz w:val="22"/>
-          <w:szCs w:val="22"/>
-        </w:rPr>
-        <w:t xml:space="preserve">Dashboard insights — AI writes short, plain-language insights for trends the team should notice.</w:t>
-      </w:r>
-    </w:p>
-    <w:p>
-      <w:pPr>
-        <w:pStyle w:val="ListParagraph"/>
-        <w:numPr>
-          <w:ilvl w:val="0"/>
-          <w:numId w:val="2"/>
-        </w:numPr>
-        <w:spacing w:after="40" w:before="40" w:line="300"/>
-      </w:pPr>
-      <w:r>
-        <w:rPr>
-          <w:color w:val="1A1F2B"/>
-          <w:sz w:val="22"/>
-          <w:szCs w:val="22"/>
-        </w:rPr>
-        <w:t xml:space="preserve">Compliance reports — AI drafts the narrative section of a compliance export.</w:t>
+        <w:t xml:space="preserve">Judge scoring — a cheaper, smaller model (Claude Haiku 4.5) grades the answers from a service under test.</w:t>
+      </w:r>
+    </w:p>
+    <w:p>
+      <w:pPr>
+        <w:pStyle w:val="ListParagraph"/>
+        <w:numPr>
+          <w:ilvl w:val="0"/>
+          <w:numId w:val="2"/>
+        </w:numPr>
+        <w:spacing w:after="40" w:before="40" w:line="300"/>
+      </w:pPr>
+      <w:r>
+        <w:rPr>
+          <w:color w:val="1A1F2B"/>
+          <w:sz w:val="22"/>
+          <w:szCs w:val="22"/>
+        </w:rPr>
+        <w:t xml:space="preserve">Hallucination detection — the same Haiku judge checks whether the service fabricated anything.</w:t>
+      </w:r>
+    </w:p>
+    <w:p>
+      <w:pPr>
+        <w:pStyle w:val="ListParagraph"/>
+        <w:numPr>
+          <w:ilvl w:val="0"/>
+          <w:numId w:val="2"/>
+        </w:numPr>
+        <w:spacing w:after="40" w:before="40" w:line="300"/>
+      </w:pPr>
+      <w:r>
+        <w:rPr>
+          <w:color w:val="1A1F2B"/>
+          <w:sz w:val="22"/>
+          <w:szCs w:val="22"/>
+        </w:rPr>
+        <w:t xml:space="preserve">Prompt-injection classifier — Haiku runs as a second layer over the regex tripwire on every input, catching paraphrased or novel injection attempts the regex misses.</w:t>
+      </w:r>
+    </w:p>
+    <w:p>
+      <w:pPr>
+        <w:pStyle w:val="ListParagraph"/>
+        <w:numPr>
+          <w:ilvl w:val="0"/>
+          <w:numId w:val="2"/>
+        </w:numPr>
+        <w:spacing w:after="40" w:before="40" w:line="300"/>
+      </w:pPr>
+      <w:r>
+        <w:rPr>
+          <w:color w:val="1A1F2B"/>
+          <w:sz w:val="22"/>
+          <w:szCs w:val="22"/>
+        </w:rPr>
+        <w:t xml:space="preserve">Incident summaries — Sonnet drafts a stakeholder-friendly write-up of the problem and root causes.</w:t>
+      </w:r>
+    </w:p>
+    <w:p>
+      <w:pPr>
+        <w:pStyle w:val="ListParagraph"/>
+        <w:numPr>
+          <w:ilvl w:val="0"/>
+          <w:numId w:val="2"/>
+        </w:numPr>
+        <w:spacing w:after="40" w:before="40" w:line="300"/>
+      </w:pPr>
+      <w:r>
+        <w:rPr>
+          <w:color w:val="1A1F2B"/>
+          <w:sz w:val="22"/>
+          <w:szCs w:val="22"/>
+        </w:rPr>
+        <w:t xml:space="preserve">Dashboard insights — Sonnet writes short, plain-language insights for trends the team should notice.</w:t>
+      </w:r>
+    </w:p>
+    <w:p>
+      <w:pPr>
+        <w:pStyle w:val="ListParagraph"/>
+        <w:numPr>
+          <w:ilvl w:val="0"/>
+          <w:numId w:val="2"/>
+        </w:numPr>
+        <w:spacing w:after="40" w:before="40" w:line="300"/>
+      </w:pPr>
+      <w:r>
+        <w:rPr>
+          <w:color w:val="1A1F2B"/>
+          <w:sz w:val="22"/>
+          <w:szCs w:val="22"/>
+        </w:rPr>
+        <w:t xml:space="preserve">Compliance reports — Sonnet drafts the narrative section of a compliance export.</w:t>
       </w:r>
     </w:p>
     <w:p>
@@ -3030,7 +3048,7 @@
           <w:sz w:val="28"/>
           <w:szCs w:val="28"/>
         </w:rPr>
-        <w:t xml:space="preserve">What AI helps with</w:t>
+        <w:t xml:space="preserve">The two-tier model economy</w:t>
       </w:r>
     </w:p>
     <w:p>
@@ -3043,7 +3061,91 @@
           <w:sz w:val="22"/>
           <w:szCs w:val="22"/>
         </w:rPr>
-        <w:t xml:space="preserve">AI speeds up reading, summarising, and drafting. It scores an answer in seconds, writes a stakeholder update in under a minute, and explains a compliance posture in plain language. None of this replaces the team’s judgement — it just removes the blank page.</w:t>
+        <w:t xml:space="preserve">The platform uses two Anthropic models, each with a clearly defined role. Claude Sonnet 4.6 is the actor — it plays the service under test and writes every synthesis output. Claude Haiku 4.5 is the judge and the injection detector — it grades factuality and hallucination on every evaluation, and it provides the LLM layer of the input safety scan. Per-model pricing is recorded on every row so the cost ledger stays honest when a Haiku call and a Sonnet call sit side by side.</w:t>
+      </w:r>
+    </w:p>
+    <w:p>
+      <w:pPr>
+        <w:pStyle w:val="ListParagraph"/>
+        <w:numPr>
+          <w:ilvl w:val="0"/>
+          <w:numId w:val="2"/>
+        </w:numPr>
+        <w:spacing w:after="40" w:before="40" w:line="300"/>
+      </w:pPr>
+      <w:r>
+        <w:rPr>
+          <w:b/>
+          <w:bCs/>
+          <w:color w:val="1B2A4E"/>
+          <w:sz w:val="22"/>
+          <w:szCs w:val="22"/>
+        </w:rPr>
+        <w:t xml:space="preserve">Why two tiers — </w:t>
+      </w:r>
+      <w:r>
+        <w:rPr>
+          <w:color w:val="1A1F2B"/>
+          <w:sz w:val="22"/>
+          <w:szCs w:val="22"/>
+        </w:rPr>
+        <w:t xml:space="preserve">different size and training emphasis on the judge partially breaks the “model scoring itself” correlation, and Haiku is roughly a third the cost of Sonnet, so running a second layer on every input is affordable.</w:t>
+      </w:r>
+    </w:p>
+    <w:p>
+      <w:pPr>
+        <w:pStyle w:val="ListParagraph"/>
+        <w:numPr>
+          <w:ilvl w:val="0"/>
+          <w:numId w:val="2"/>
+        </w:numPr>
+        <w:spacing w:after="40" w:before="40" w:line="300"/>
+      </w:pPr>
+      <w:r>
+        <w:rPr>
+          <w:b/>
+          <w:bCs/>
+          <w:color w:val="1B2A4E"/>
+          <w:sz w:val="22"/>
+          <w:szCs w:val="22"/>
+        </w:rPr>
+        <w:t xml:space="preserve">Why one vendor today — </w:t>
+      </w:r>
+      <w:r>
+        <w:rPr>
+          <w:color w:val="1A1F2B"/>
+          <w:sz w:val="22"/>
+          <w:szCs w:val="22"/>
+        </w:rPr>
+        <w:t xml:space="preserve">one SDK, one authentication model, one rate-limit rhythm; swapping a second vendor in is a single configuration change because every AI call already flows through one function.</w:t>
+      </w:r>
+    </w:p>
+    <w:p>
+      <w:pPr>
+        <w:pStyle w:val="ListParagraph"/>
+        <w:numPr>
+          <w:ilvl w:val="0"/>
+          <w:numId w:val="2"/>
+        </w:numPr>
+        <w:spacing w:after="40" w:before="40" w:line="300"/>
+      </w:pPr>
+      <w:r>
+        <w:rPr>
+          <w:b/>
+          <w:bCs/>
+          <w:color w:val="1B2A4E"/>
+          <w:sz w:val="22"/>
+          <w:szCs w:val="22"/>
+        </w:rPr>
+        <w:t xml:space="preserve">Honest caveat — </w:t>
+      </w:r>
+      <w:r>
+        <w:rPr>
+          <w:color w:val="1A1F2B"/>
+          <w:sz w:val="22"/>
+          <w:szCs w:val="22"/>
+        </w:rPr>
+        <w:t xml:space="preserve">two tiers are not an ensemble. Both are still Anthropic models. A true cross-vendor judge (OpenAI or Gemini) is a documented next step on the roadmap.</w:t>
       </w:r>
     </w:p>
     <w:p>
@@ -3059,7 +3161,7 @@
           <w:sz w:val="28"/>
           <w:szCs w:val="28"/>
         </w:rPr>
-        <w:t xml:space="preserve">Why human approval is required</w:t>
+        <w:t xml:space="preserve">What AI helps with</w:t>
       </w:r>
     </w:p>
     <w:p>
@@ -3072,7 +3174,7 @@
           <w:sz w:val="22"/>
           <w:szCs w:val="22"/>
         </w:rPr>
-        <w:t xml:space="preserve">AI can hallucinate, misinterpret context, or generate plausible-sounding but wrong content. Every AI-generated artifact that goes into the record (incident summaries, compliance narratives, dashboard insights) must be reviewed by a named human. Approval requires a short note explaining what the reviewer verified. The draft is never promoted to official without that step.</w:t>
+        <w:t xml:space="preserve">AI speeds up reading, summarising, and drafting. It scores an answer in seconds, writes a stakeholder update in under a minute, and explains a compliance posture in plain language. None of this replaces the team’s judgement — it just removes the blank page.</w:t>
       </w:r>
     </w:p>
     <w:p>
@@ -3088,6 +3190,35 @@
           <w:sz w:val="28"/>
           <w:szCs w:val="28"/>
         </w:rPr>
+        <w:t xml:space="preserve">Why human approval is required</w:t>
+      </w:r>
+    </w:p>
+    <w:p>
+      <w:pPr>
+        <w:spacing w:after="160" w:before="80" w:line="320"/>
+      </w:pPr>
+      <w:r>
+        <w:rPr>
+          <w:color w:val="1A1F2B"/>
+          <w:sz w:val="22"/>
+          <w:szCs w:val="22"/>
+        </w:rPr>
+        <w:t xml:space="preserve">AI can hallucinate, misinterpret context, or generate plausible-sounding but wrong content. Every AI-generated artifact that goes into the record (incident summaries, compliance narratives, dashboard insights) must be reviewed by a named human. Approval requires a short note explaining what the reviewer verified. The draft is never promoted to official without that step.</w:t>
+      </w:r>
+    </w:p>
+    <w:p>
+      <w:pPr>
+        <w:pStyle w:val="Heading2"/>
+        <w:spacing w:after="120" w:before="280"/>
+      </w:pPr>
+      <w:r>
+        <w:rPr>
+          <w:b/>
+          <w:bCs/>
+          <w:color w:val="1B2A4E"/>
+          <w:sz w:val="28"/>
+          <w:szCs w:val="28"/>
+        </w:rPr>
         <w:t xml:space="preserve">The six-stage safety pipeline</w:t>
       </w:r>
     </w:p>
@@ -3137,7 +3268,7 @@
           <w:sz w:val="22"/>
           <w:szCs w:val="22"/>
         </w:rPr>
-        <w:t xml:space="preserve">Input safety scan — the prompt is checked for injection patterns, PII, toxic content, and length.</w:t>
+        <w:t xml:space="preserve">Input safety scan (two layers) — the prompt is checked first by a regex tripwire for known injection patterns, personal information, toxic content, and length, and then by a Haiku-based LLM classifier that catches paraphrased or novel injection attempts the regex cannot see. The two layers are merged conservatively: whichever layer returns the higher risk wins, so neither can silence the other. The classifier is fail-open — if it errors or times out, regex stays authoritative and the actor path is never blocked by an injection-checker outage.</w:t>
       </w:r>
     </w:p>
     <w:p>
@@ -3155,7 +3286,7 @@
           <w:sz w:val="22"/>
           <w:szCs w:val="22"/>
         </w:rPr>
-        <w:t xml:space="preserve">Budget reserve — the call must fit inside the daily and per-minute budgets; concurrent calls cannot collectively overspend. The platform enforces thirty calls per minute globally, twenty per user per minute, five US dollars per day, and twenty-five US dollars per month.</w:t>
+        <w:t xml:space="preserve">Budget reserve — the call must fit inside the daily and per-minute budgets; concurrent calls cannot collectively overspend. The platform enforces sixty calls per minute globally and forty per user per minute — sized for the two-tier architecture’s four Claude calls per user request (one actor, one injection classifier, two judges) — alongside five US dollars per day and twenty-five US dollars per month. Cost accounting is per-model, so a Haiku row at one dollar per million input tokens does not get priced at Sonnet’s three dollars.</w:t>
       </w:r>
     </w:p>
     <w:p>
@@ -3173,7 +3304,7 @@
           <w:sz w:val="22"/>
           <w:szCs w:val="22"/>
         </w:rPr>
-        <w:t xml:space="preserve">API call — the actual request to Claude, with automatic retry on transient failure.</w:t>
+        <w:t xml:space="preserve">API call — the actual request to Claude (Sonnet for the actor, Haiku for judges and injection classifier), with automatic retry on transient failure.</w:t>
       </w:r>
     </w:p>
     <w:p>
@@ -3209,7 +3340,7 @@
           <w:sz w:val="22"/>
           <w:szCs w:val="22"/>
         </w:rPr>
-        <w:t xml:space="preserve">Persist and audit — the call is saved with its cost, tokens, latency, and safety flags, and an audit entry is written.</w:t>
+        <w:t xml:space="preserve">Persist and audit — the call is saved with its cost, tokens, latency, the model that handled it, and any safety flags, and an audit entry is written.</w:t>
       </w:r>
     </w:p>
     <w:p>
@@ -3278,7 +3409,7 @@
                 <w:sz w:val="22"/>
                 <w:szCs w:val="22"/>
               </w:rPr>
-              <w:t xml:space="preserve">There is exactly one place in the code that talks to the AI. Every feature that uses AI enters through that one function. Change a safety rule there, and every feature inherits it immediately.</w:t>
+              <w:t xml:space="preserve">There is exactly one place in the code that talks to the AI. Every feature that uses AI enters through that one function. Change a safety rule there, and every feature inherits it immediately. The only exception is the injection classifier itself — it enters through a sibling function that skips the input scan, because if it re-entered the scan it would loop forever trying to classify its own prompt. Every other feature routes through the full six-stage path.</w:t>
             </w:r>
           </w:p>
         </w:tc>
@@ -3689,61 +3820,61 @@
           <w:sz w:val="22"/>
           <w:szCs w:val="22"/>
         </w:rPr>
-        <w:t xml:space="preserve">One hundred and thirty-five tests across thirteen test files, covering authentication, services, evaluations, incidents, governance, drafts, and the AI pipeline.</w:t>
-      </w:r>
-    </w:p>
-    <w:p>
-      <w:pPr>
-        <w:pStyle w:val="ListParagraph"/>
-        <w:numPr>
-          <w:ilvl w:val="0"/>
-          <w:numId w:val="2"/>
-        </w:numPr>
-        <w:spacing w:after="40" w:before="40" w:line="300"/>
-      </w:pPr>
-      <w:r>
-        <w:rPr>
-          <w:color w:val="1A1F2B"/>
-          <w:sz w:val="22"/>
-          <w:szCs w:val="22"/>
-        </w:rPr>
-        <w:t xml:space="preserve">Coverage is measured and must stay above a sixty-five percent floor that fails the build if it drops; the actual coverage today is around seventy-one percent.</w:t>
-      </w:r>
-    </w:p>
-    <w:p>
-      <w:pPr>
-        <w:pStyle w:val="ListParagraph"/>
-        <w:numPr>
-          <w:ilvl w:val="0"/>
-          <w:numId w:val="2"/>
-        </w:numPr>
-        <w:spacing w:after="40" w:before="40" w:line="300"/>
-      </w:pPr>
-      <w:r>
-        <w:rPr>
-          <w:color w:val="1A1F2B"/>
-          <w:sz w:val="22"/>
-          <w:szCs w:val="22"/>
-        </w:rPr>
-        <w:t xml:space="preserve">The full suite runs in roughly forty-six seconds because tests use an in-memory database and a simulated AI client — no network calls, no cost.</w:t>
-      </w:r>
-    </w:p>
-    <w:p>
-      <w:pPr>
-        <w:pStyle w:val="ListParagraph"/>
-        <w:numPr>
-          <w:ilvl w:val="0"/>
-          <w:numId w:val="2"/>
-        </w:numPr>
-        <w:spacing w:after="40" w:before="40" w:line="300"/>
-      </w:pPr>
-      <w:r>
-        <w:rPr>
-          <w:color w:val="1A1F2B"/>
-          <w:sz w:val="22"/>
-          <w:szCs w:val="22"/>
-        </w:rPr>
-        <w:t xml:space="preserve">The codebase is around eight thousand lines of backend Python, six thousand lines of React, and two and a half thousand lines of tests.</w:t>
+        <w:t xml:space="preserve">Approximately one hundred and fifty-eight tests across nineteen test files, covering authentication, services, evaluations, incidents, governance, drafts, per-model pricing, the two-layer safety scanner, the injection classifier, probe liveness, judge routing, and the AI pipeline end to end.</w:t>
+      </w:r>
+    </w:p>
+    <w:p>
+      <w:pPr>
+        <w:pStyle w:val="ListParagraph"/>
+        <w:numPr>
+          <w:ilvl w:val="0"/>
+          <w:numId w:val="2"/>
+        </w:numPr>
+        <w:spacing w:after="40" w:before="40" w:line="300"/>
+      </w:pPr>
+      <w:r>
+        <w:rPr>
+          <w:color w:val="1A1F2B"/>
+          <w:sz w:val="22"/>
+          <w:szCs w:val="22"/>
+        </w:rPr>
+        <w:t xml:space="preserve">Coverage is measured and must stay above a sixty-five percent floor that fails the build if it drops; the actual coverage today is around seventy-eight percent.</w:t>
+      </w:r>
+    </w:p>
+    <w:p>
+      <w:pPr>
+        <w:pStyle w:val="ListParagraph"/>
+        <w:numPr>
+          <w:ilvl w:val="0"/>
+          <w:numId w:val="2"/>
+        </w:numPr>
+        <w:spacing w:after="40" w:before="40" w:line="300"/>
+      </w:pPr>
+      <w:r>
+        <w:rPr>
+          <w:color w:val="1A1F2B"/>
+          <w:sz w:val="22"/>
+          <w:szCs w:val="22"/>
+        </w:rPr>
+        <w:t xml:space="preserve">The full suite runs in under a minute because tests use an in-memory database and a simulated AI client — no network calls, no cost.</w:t>
+      </w:r>
+    </w:p>
+    <w:p>
+      <w:pPr>
+        <w:pStyle w:val="ListParagraph"/>
+        <w:numPr>
+          <w:ilvl w:val="0"/>
+          <w:numId w:val="2"/>
+        </w:numPr>
+        <w:spacing w:after="40" w:before="40" w:line="300"/>
+      </w:pPr>
+      <w:r>
+        <w:rPr>
+          <w:color w:val="1A1F2B"/>
+          <w:sz w:val="22"/>
+          <w:szCs w:val="22"/>
+        </w:rPr>
+        <w:t xml:space="preserve">The codebase is around eight thousand lines of backend Python, six thousand lines of React, and three thousand lines of tests.</w:t>
       </w:r>
     </w:p>
     <w:p>
@@ -3932,6 +4063,174 @@
     </w:p>
     <w:p>
       <w:pPr>
+        <w:pStyle w:val="ListParagraph"/>
+        <w:numPr>
+          <w:ilvl w:val="0"/>
+          <w:numId w:val="2"/>
+        </w:numPr>
+        <w:spacing w:after="40" w:before="40" w:line="300"/>
+      </w:pPr>
+      <w:r>
+        <w:rPr>
+          <w:b/>
+          <w:bCs/>
+          <w:color w:val="1B2A4E"/>
+          <w:sz w:val="22"/>
+          <w:szCs w:val="22"/>
+        </w:rPr>
+        <w:t xml:space="preserve">Two-layer safety test — </w:t>
+      </w:r>
+      <w:r>
+        <w:rPr>
+          <w:color w:val="1A1F2B"/>
+          <w:sz w:val="22"/>
+          <w:szCs w:val="22"/>
+        </w:rPr>
+        <w:t xml:space="preserve">six tests that prove the regex tripwire and the Haiku LLM classifier run independently, their risk scores merge via max-not-min, and a classifier outage leaves the regex layer authoritative (fail-open).</w:t>
+      </w:r>
+    </w:p>
+    <w:p>
+      <w:pPr>
+        <w:pStyle w:val="ListParagraph"/>
+        <w:numPr>
+          <w:ilvl w:val="0"/>
+          <w:numId w:val="2"/>
+        </w:numPr>
+        <w:spacing w:after="40" w:before="40" w:line="300"/>
+      </w:pPr>
+      <w:r>
+        <w:rPr>
+          <w:b/>
+          <w:bCs/>
+          <w:color w:val="1B2A4E"/>
+          <w:sz w:val="22"/>
+          <w:szCs w:val="22"/>
+        </w:rPr>
+        <w:t xml:space="preserve">Injection-classifier test — </w:t>
+      </w:r>
+      <w:r>
+        <w:rPr>
+          <w:color w:val="1A1F2B"/>
+          <w:sz w:val="22"/>
+          <w:szCs w:val="22"/>
+        </w:rPr>
+        <w:t xml:space="preserve">six tests for the Haiku-based prompt-injection detector: true positives on known injection phrasings, true negatives on benign prompts, and graceful fail-open when the classifier errors.</w:t>
+      </w:r>
+    </w:p>
+    <w:p>
+      <w:pPr>
+        <w:pStyle w:val="ListParagraph"/>
+        <w:numPr>
+          <w:ilvl w:val="0"/>
+          <w:numId w:val="2"/>
+        </w:numPr>
+        <w:spacing w:after="40" w:before="40" w:line="300"/>
+      </w:pPr>
+      <w:r>
+        <w:rPr>
+          <w:b/>
+          <w:bCs/>
+          <w:color w:val="1B2A4E"/>
+          <w:sz w:val="22"/>
+          <w:szCs w:val="22"/>
+        </w:rPr>
+        <w:t xml:space="preserve">Per-model pricing test — </w:t>
+      </w:r>
+      <w:r>
+        <w:rPr>
+          <w:color w:val="1A1F2B"/>
+          <w:sz w:val="22"/>
+          <w:szCs w:val="22"/>
+        </w:rPr>
+        <w:t xml:space="preserve">five tests that verify Sonnet rows are priced at three dollars per million input tokens and Haiku rows at one dollar, with an unknown-model fallback that warns once and falls back to Sonnet rates so cost is never silently under-counted.</w:t>
+      </w:r>
+    </w:p>
+    <w:p>
+      <w:pPr>
+        <w:pStyle w:val="ListParagraph"/>
+        <w:numPr>
+          <w:ilvl w:val="0"/>
+          <w:numId w:val="2"/>
+        </w:numPr>
+        <w:spacing w:after="40" w:before="40" w:line="300"/>
+      </w:pPr>
+      <w:r>
+        <w:rPr>
+          <w:b/>
+          <w:bCs/>
+          <w:color w:val="1B2A4E"/>
+          <w:sz w:val="22"/>
+          <w:szCs w:val="22"/>
+        </w:rPr>
+        <w:t xml:space="preserve">Judge-routing test — </w:t>
+      </w:r>
+      <w:r>
+        <w:rPr>
+          <w:color w:val="1A1F2B"/>
+          <w:sz w:val="22"/>
+          <w:szCs w:val="22"/>
+        </w:rPr>
+        <w:t xml:space="preserve">four tests that prove the judge calls are routed to the Haiku model, not the Sonnet actor, and that the EvalRun row records the exact judge model used.</w:t>
+      </w:r>
+    </w:p>
+    <w:p>
+      <w:pPr>
+        <w:pStyle w:val="ListParagraph"/>
+        <w:numPr>
+          <w:ilvl w:val="0"/>
+          <w:numId w:val="2"/>
+        </w:numPr>
+        <w:spacing w:after="40" w:before="40" w:line="300"/>
+      </w:pPr>
+      <w:r>
+        <w:rPr>
+          <w:b/>
+          <w:bCs/>
+          <w:color w:val="1B2A4E"/>
+          <w:sz w:val="22"/>
+          <w:szCs w:val="22"/>
+        </w:rPr>
+        <w:t xml:space="preserve">Probe-liveness test — </w:t>
+      </w:r>
+      <w:r>
+        <w:rPr>
+          <w:color w:val="1A1F2B"/>
+          <w:sz w:val="22"/>
+          <w:szCs w:val="22"/>
+        </w:rPr>
+        <w:t xml:space="preserve">five tests that prove scheduled health checks treat 4xx responses as reachable (many AI endpoints are POST-only and return 405 to anonymous GETs) and only count 5xx and network errors as failure.</w:t>
+      </w:r>
+    </w:p>
+    <w:p>
+      <w:pPr>
+        <w:pStyle w:val="ListParagraph"/>
+        <w:numPr>
+          <w:ilvl w:val="0"/>
+          <w:numId w:val="2"/>
+        </w:numPr>
+        <w:spacing w:after="40" w:before="40" w:line="300"/>
+      </w:pPr>
+      <w:r>
+        <w:rPr>
+          <w:b/>
+          <w:bCs/>
+          <w:color w:val="1B2A4E"/>
+          <w:sz w:val="22"/>
+          <w:szCs w:val="22"/>
+        </w:rPr>
+        <w:t xml:space="preserve">Core-path test — </w:t>
+      </w:r>
+      <w:r>
+        <w:rPr>
+          <w:color w:val="1A1F2B"/>
+          <w:sz w:val="22"/>
+          <w:szCs w:val="22"/>
+        </w:rPr>
+        <w:t xml:space="preserve">two tests that prove the public API call path always runs input safety, while the core path (used by the injection classifier itself) skips it — the recursion-prevention contract is enforced by tests, not trust.</w:t>
+      </w:r>
+    </w:p>
+    <w:p>
+      <w:pPr>
         <w:pStyle w:val="Heading2"/>
         <w:spacing w:after="120" w:before="280"/>
       </w:pPr>
@@ -4039,7 +4338,7 @@
           <w:sz w:val="22"/>
           <w:szCs w:val="22"/>
         </w:rPr>
-        <w:t xml:space="preserve">Every page that shows live data polls at thirty seconds and displays a visible “updated N seconds ago” indicator with a one-shot pulse animation.</w:t>
+        <w:t xml:space="preserve">Every page that shows live data polls at a right-sized cadence (typically thirty to sixty seconds) and displays a visible “updated N seconds ago” indicator with a one-shot pulse animation.</w:t>
       </w:r>
     </w:p>
     <w:p>
@@ -4129,7 +4428,7 @@
           <w:sz w:val="22"/>
           <w:szCs w:val="22"/>
         </w:rPr>
-        <w:t xml:space="preserve">Every form uses inline errors and toast notifications, not blocking alert dialogs.</w:t>
+        <w:t xml:space="preserve">Every form uses inline errors and toast notifications, not blocking alert dialogs. The browser’s native window.prompt and window.confirm have been replaced with shared Modal-based dialogs everywhere the user types a reviewer note or confirms a destructive action.</w:t>
       </w:r>
     </w:p>
     <w:p>
@@ -4166,6 +4465,60 @@
           <w:szCs w:val="22"/>
         </w:rPr>
         <w:t xml:space="preserve">Every loading, approving, or verifying state exposes an accessibility marker (aria-busy, aria-live) so screen readers follow along.</w:t>
+      </w:r>
+    </w:p>
+    <w:p>
+      <w:pPr>
+        <w:pStyle w:val="ListParagraph"/>
+        <w:numPr>
+          <w:ilvl w:val="0"/>
+          <w:numId w:val="2"/>
+        </w:numPr>
+        <w:spacing w:after="40" w:before="40" w:line="300"/>
+      </w:pPr>
+      <w:r>
+        <w:rPr>
+          <w:color w:val="1A1F2B"/>
+          <w:sz w:val="22"/>
+          <w:szCs w:val="22"/>
+        </w:rPr>
+        <w:t xml:space="preserve">Every KPI tile on the Dashboard exposes a structured tooltip (title, plain-English body, data-source / window line) so “Error Rate means quality drift, not HTTP failures” is visible on hover rather than buried in the docs.</w:t>
+      </w:r>
+    </w:p>
+    <w:p>
+      <w:pPr>
+        <w:pStyle w:val="ListParagraph"/>
+        <w:numPr>
+          <w:ilvl w:val="0"/>
+          <w:numId w:val="2"/>
+        </w:numPr>
+        <w:spacing w:after="40" w:before="40" w:line="300"/>
+      </w:pPr>
+      <w:r>
+        <w:rPr>
+          <w:color w:val="1A1F2B"/>
+          <w:sz w:val="22"/>
+          <w:szCs w:val="22"/>
+        </w:rPr>
+        <w:t xml:space="preserve">A persistent Notifications drawer in the top bar surfaces new drift alerts across sessions, and a DateTimeField component keeps scheduling inputs consistent between Incidents, Maintenance, and Evaluations.</w:t>
+      </w:r>
+    </w:p>
+    <w:p>
+      <w:pPr>
+        <w:pStyle w:val="ListParagraph"/>
+        <w:numPr>
+          <w:ilvl w:val="0"/>
+          <w:numId w:val="2"/>
+        </w:numPr>
+        <w:spacing w:after="40" w:before="40" w:line="300"/>
+      </w:pPr>
+      <w:r>
+        <w:rPr>
+          <w:color w:val="1A1F2B"/>
+          <w:sz w:val="22"/>
+          <w:szCs w:val="22"/>
+        </w:rPr>
+        <w:t xml:space="preserve">The audit log on the Governance page now renders a volume-stats strip (events, actors, last 24 h, top action), categorised action pills, and human-friendly target labels — the same raw rows, rendered for compliance reviewers instead of engineers.</w:t>
       </w:r>
     </w:p>
     <w:p>
@@ -4346,7 +4699,7 @@
           <w:sz w:val="22"/>
           <w:szCs w:val="22"/>
         </w:rPr>
-        <w:t xml:space="preserve">known injection patterns are blocked at the input stage; the platform refuses to process them.</w:t>
+        <w:t xml:space="preserve">a two-layer defence at the input stage. Fifteen regex patterns catch known injection phrasings, and a Haiku-based LLM classifier provides an independent second opinion that catches paraphrased or novel attempts. The two layers merge conservatively (max risk wins), and the classifier fails open so an outage never unblocks an actual injection. The reviewer note contract Sakir demonstrated is the third backstop — anything that slips past both scanners still needs a human approver to sign off.</w:t>
       </w:r>
     </w:p>
     <w:p>
@@ -4430,7 +4783,7 @@
           <w:sz w:val="22"/>
           <w:szCs w:val="22"/>
         </w:rPr>
-        <w:t xml:space="preserve">daily and per-minute budgets are enforced atomically so even a surge of concurrent requests cannot exceed them.</w:t>
+        <w:t xml:space="preserve">daily and per-minute budgets are enforced atomically so even a surge of concurrent requests cannot exceed them. Rate limits are sixty calls per minute globally and forty per user per minute — sized for the two-tier architecture’s four Claude calls per user evaluation request — with five US dollars per day and twenty-five per month as the dollar cap.</w:t>
       </w:r>
     </w:p>
     <w:p>
@@ -4874,15 +5227,15 @@
           <w:sz w:val="22"/>
           <w:szCs w:val="22"/>
         </w:rPr>
-        <w:t xml:space="preserve">Single AI judge — </w:t>
-      </w:r>
-      <w:r>
-        <w:rPr>
-          <w:color w:val="1A1F2B"/>
-          <w:sz w:val="22"/>
-          <w:szCs w:val="22"/>
-        </w:rPr>
-        <w:t xml:space="preserve">one model grades every answer. A production system would use an ensemble of judges to reduce bias from any single model.</w:t>
+        <w:t xml:space="preserve">Single-vendor AI judge — </w:t>
+      </w:r>
+      <w:r>
+        <w:rPr>
+          <w:color w:val="1A1F2B"/>
+          <w:sz w:val="22"/>
+          <w:szCs w:val="22"/>
+        </w:rPr>
+        <w:t xml:space="preserve">the judge is Claude Haiku 4.5 — a different size and training emphasis from the Claude Sonnet 4.6 actor, which partially breaks the “model scoring itself” correlation. But both are still Anthropic models. A true cross-vendor ensemble (an OpenAI or Gemini second judge) is a documented next step.</w:t>
       </w:r>
     </w:p>
     <w:p>
@@ -5410,7 +5763,7 @@
           <w:sz w:val="22"/>
           <w:szCs w:val="22"/>
         </w:rPr>
-        <w:t xml:space="preserve">Multi-model judge ensemble (for example Claude Haiku as a second judge cross-validating ten percent of runs) to reduce bias and improve scoring reliability.</w:t>
+        <w:t xml:space="preserve">Cross-vendor judge (OpenAI or Gemini) cross-validating a sample of runs alongside the existing Haiku judge, to fully break the single-vendor scoring correlation that a same-family Sonnet-plus-Haiku pairing only partially addresses.</w:t>
       </w:r>
     </w:p>
     <w:p>
@@ -5655,7 +6008,7 @@
           <w:sz w:val="22"/>
           <w:szCs w:val="22"/>
         </w:rPr>
-        <w:t xml:space="preserve">Quality is measured by running a small exam against each service; a second AI call grades the answers; drift is detected two ways.</w:t>
+        <w:t xml:space="preserve">Quality is measured by running a small exam against each service; a second, smaller AI model (Claude Haiku) grades the answers — different from the Sonnet actor being scored — and drift is detected two ways.</w:t>
       </w:r>
     </w:p>
     <w:p>
@@ -5691,7 +6044,7 @@
           <w:sz w:val="22"/>
           <w:szCs w:val="22"/>
         </w:rPr>
-        <w:t xml:space="preserve">Every AI call passes through six safety stages: sensitivity check, input scan, budget reserve, API call, output scan, and audit persist.</w:t>
+        <w:t xml:space="preserve">Every AI call passes through six safety stages: sensitivity check, two-layer input scan (regex plus Haiku LLM classifier, fail-open on classifier outage), budget reserve (sixty per minute, forty per user, five dollars a day, twenty-five a month), API call, output scan, and audit persist.</w:t>
       </w:r>
     </w:p>
     <w:p>
@@ -5763,7 +6116,7 @@
           <w:sz w:val="22"/>
           <w:szCs w:val="22"/>
         </w:rPr>
-        <w:t xml:space="preserve">One hundred and thirty-five automated tests across thirteen files run in roughly forty-six seconds; the build fails if coverage drops below a sixty-five percent floor.</w:t>
+        <w:t xml:space="preserve">Approximately one hundred and fifty-eight automated tests across nineteen files run in under a minute; coverage is around seventy-eight percent and the build fails if it drops below a sixty-five percent floor.</w:t>
       </w:r>
     </w:p>
     <w:p>
@@ -5886,7 +6239,7 @@
                 <w:sz w:val="22"/>
                 <w:szCs w:val="22"/>
               </w:rPr>
-              <w:t xml:space="preserve">We built a centralised AI operations platform. Teams running AI services in production have no single place to see how those services are behaving — uptime is tracked, behaviour is not. Our platform gives them one dashboard for quality, a structured incident workflow when something breaks, and a tamper-evident audit trail that an auditor can trust. Every AI-generated summary, draft, or insight must be reviewed and approved by a named human with a note. Every action is cryptographically chained. One schema, one audit chain, one human-in-the-loop contract. It is a reference implementation with 135 automated tests, so every claim the platform makes is backed by a test that proves it works.</w:t>
+              <w:t xml:space="preserve">We built a centralised AI operations platform. Teams running AI services in production have no single place to see how those services are behaving — uptime is tracked, behaviour is not. Our platform gives them one dashboard for quality, a structured incident workflow when something breaks, and a tamper-evident audit trail that an auditor can trust. A two-tier model economy uses Sonnet as the actor and Haiku as the judge plus injection classifier, so every answer is graded by a different model from the one that produced it. Every AI-generated summary, draft, or insight must be reviewed and approved by a named human with a note. Every action is cryptographically chained. One schema, one audit chain, one human-in-the-loop contract. It is a reference implementation with approximately 158 automated tests at 78% coverage, so every claim the platform makes is backed by a test that proves it works.</w:t>
             </w:r>
           </w:p>
         </w:tc>
@@ -5992,7 +6345,7 @@
           <w:sz w:val="22"/>
           <w:szCs w:val="22"/>
         </w:rPr>
-        <w:t xml:space="preserve">When asked “what does your platform actually do?” start with the problem: “Teams running AI features have no single place to see whether their AI is still behaving correctly. Uptime does not mean quality.” Then give the solution: “Our platform is one web app that covers monitoring, evaluation, incidents, and compliance — with a human-in-the-loop contract on every AI output and a tamper-evident audit chain.” Finish with the proof: “One hundred and thirty-five automated tests back the platform’s claims. A single button verifies the audit chain is intact. A single date range produces a compliance report an auditor can read.”</w:t>
+        <w:t xml:space="preserve">When asked “what does your platform actually do?” start with the problem: “Teams running AI features have no single place to see whether their AI is still behaving correctly. Uptime does not mean quality.” Then give the solution: “Our platform is one web app that covers monitoring, evaluation, incidents, and compliance — with a two-tier model economy where Haiku judges what Sonnet produces, a human-in-the-loop contract on every AI output, and a tamper-evident audit chain.” Finish with the proof: “Approximately one hundred and fifty-eight automated tests back the platform’s claims. A single button verifies the audit chain is intact. A single date range produces a compliance report an auditor can read.”</w:t>
       </w:r>
     </w:p>
     <w:p>

</xml_diff>